<commit_message>
Publish demo credentials and update reports
</commit_message>
<xml_diff>
--- a/Bai_lam_De3_WordPress/Bao_cao_De_3_WordPress.docx
+++ b/Bai_lam_De3_WordPress/Bao_cao_De_3_WordPress.docx
@@ -2236,17 +2236,89 @@
                 <w:sz w:val="18"/>
               </w:rPr>
               <w:t>cp .env.example .env</w:t>
-              <w:br/>
-              <w:t># thay tất cả mật khẩu mẫu trong .env</w:t>
-              <w:br/>
+            </w:r>
+          </w:p>
+          <w:p>
+            <w:pPr>
+              <w:spacing w:before="0" w:after="0" w:line="240" w:lineRule="auto"/>
+              <w:ind w:left="0" w:right="0" w:firstLine="0"/>
+              <w:jc w:val="left"/>
+            </w:pPr>
+            <w:r>
+              <w:rPr>
+                <w:rFonts w:ascii="Consolas" w:hAnsi="Consolas"/>
+                <w:sz w:val="18"/>
+              </w:rPr>
+              <w:t># mật khẩu demo admin/admin123@, chỉ dùng local</w:t>
+            </w:r>
+          </w:p>
+          <w:p>
+            <w:pPr>
+              <w:spacing w:before="0" w:after="0" w:line="240" w:lineRule="auto"/>
+              <w:ind w:left="0" w:right="0" w:firstLine="0"/>
+              <w:jc w:val="left"/>
+            </w:pPr>
+            <w:r>
+              <w:rPr>
+                <w:rFonts w:ascii="Consolas" w:hAnsi="Consolas"/>
+                <w:sz w:val="18"/>
+              </w:rPr>
               <w:t>./scripts/generate-dev-cert.sh</w:t>
-              <w:br/>
+            </w:r>
+          </w:p>
+          <w:p>
+            <w:pPr>
+              <w:spacing w:before="0" w:after="0" w:line="240" w:lineRule="auto"/>
+              <w:ind w:left="0" w:right="0" w:firstLine="0"/>
+              <w:jc w:val="left"/>
+            </w:pPr>
+            <w:r>
+              <w:rPr>
+                <w:rFonts w:ascii="Consolas" w:hAnsi="Consolas"/>
+                <w:sz w:val="18"/>
+              </w:rPr>
               <w:t>docker compose pull</w:t>
-              <w:br/>
+            </w:r>
+          </w:p>
+          <w:p>
+            <w:pPr>
+              <w:spacing w:before="0" w:after="0" w:line="240" w:lineRule="auto"/>
+              <w:ind w:left="0" w:right="0" w:firstLine="0"/>
+              <w:jc w:val="left"/>
+            </w:pPr>
+            <w:r>
+              <w:rPr>
+                <w:rFonts w:ascii="Consolas" w:hAnsi="Consolas"/>
+                <w:sz w:val="18"/>
+              </w:rPr>
               <w:t>docker compose up -d</w:t>
-              <w:br/>
+            </w:r>
+          </w:p>
+          <w:p>
+            <w:pPr>
+              <w:spacing w:before="0" w:after="0" w:line="240" w:lineRule="auto"/>
+              <w:ind w:left="0" w:right="0" w:firstLine="0"/>
+              <w:jc w:val="left"/>
+            </w:pPr>
+            <w:r>
+              <w:rPr>
+                <w:rFonts w:ascii="Consolas" w:hAnsi="Consolas"/>
+                <w:sz w:val="18"/>
+              </w:rPr>
               <w:t>docker compose ps</w:t>
-              <w:br/>
+            </w:r>
+          </w:p>
+          <w:p>
+            <w:pPr>
+              <w:spacing w:before="0" w:after="0" w:line="240" w:lineRule="auto"/>
+              <w:ind w:left="0" w:right="0" w:firstLine="0"/>
+              <w:jc w:val="left"/>
+            </w:pPr>
+            <w:r>
+              <w:rPr>
+                <w:rFonts w:ascii="Consolas" w:hAnsi="Consolas"/>
+                <w:sz w:val="18"/>
+              </w:rPr>
               <w:t>docker compose logs -f wordpress-init</w:t>
             </w:r>
           </w:p>
@@ -2323,7 +2395,7 @@
         <w:jc w:val="both"/>
       </w:pPr>
       <w:r>
-        <w:t>Thư mục Bai_lam_De3_WordPress nằm trong repository Git của dự án. Lịch sử hiện có ba commit theo các mốc WordPress/MySQL và reverse proxy; giám sát Prometheus/Grafana; tập trung log Loki/Promtail và hardening. Gói bài làm trong thư mục này được thêm bằng một commit riêng. Repository chưa có remote GitHub, vì vậy trước khi nộp cần tạo repository theo mã sinh viên, cấu hình remote và push nhánh dự án. Báo cáo không ghi URL khi chưa được publish.</w:t>
+        <w:t>Thư mục Bai_lam_De3_WordPress nằm trong repository đã publish tại https://github.com/Study332/DTC245010044_De3_WordPress, nhánh master. File .env thật không được đưa lên GitHub; khóa TLS self-signed trong dự án chỉ dùng cho localhost, không dùng cho website công khai.</w:t>
       </w:r>
     </w:p>
     <w:p>
@@ -2438,7 +2510,7 @@
           <w:color w:val="000000"/>
           <w:sz w:val="26"/>
         </w:rPr>
-        <w:t>Biến SITE_URL mặc định là https://localhost. Tài khoản WordPress, MySQL và Grafana được cấu hình trong .env. Các mật khẩu phải thay bằng chuỗi dài, riêng biệt trước khi chạy. Thông tin khởi tạo chỉ áp dụng khi volume dữ liệu được tạo lần đầu.</w:t>
+        <w:t>Biến SITE_URL mặc định là https://localhost. Tài khoản và mật khẩu được lấy từ .env. Với volume đã khởi tạo, đổi giá trị trong .env không tự cập nhật mật khẩu đã lưu trong WordPress, MySQL hoặc Grafana; cần đổi trực tiếp trong dịch vụ tương ứng.</w:t>
       </w:r>
     </w:p>
     <w:p>
@@ -2478,7 +2550,7 @@
           <w:color w:val="000000"/>
           <w:sz w:val="26"/>
         </w:rPr>
-        <w:t>Máy triển khai cần Docker Engine và Docker Compose v2. Sau khi tạo .env và thay mật khẩu mẫu, chạy các lệnh sau tại thư mục dự án:</w:t>
+        <w:t>Máy triển khai cần Docker Engine và Docker Compose v2. Trên máy local, sao chép .env.example thành .env rồi chạy các lệnh sau tại thư mục dự án:</w:t>
       </w:r>
     </w:p>
     <w:p>
@@ -2532,17 +2604,89 @@
                 <w:sz w:val="18"/>
               </w:rPr>
               <w:t>cp .env.example .env</w:t>
-              <w:br/>
-              <w:t># thay tất cả mật khẩu mẫu trong .env</w:t>
-              <w:br/>
+            </w:r>
+          </w:p>
+          <w:p>
+            <w:pPr>
+              <w:spacing w:before="0" w:after="0" w:line="240" w:lineRule="auto"/>
+              <w:ind w:left="0" w:right="0" w:firstLine="0"/>
+              <w:jc w:val="left"/>
+            </w:pPr>
+            <w:r>
+              <w:rPr>
+                <w:rFonts w:ascii="Consolas" w:hAnsi="Consolas"/>
+                <w:sz w:val="18"/>
+              </w:rPr>
+              <w:t># mật khẩu demo admin/admin123@, chỉ dùng local</w:t>
+            </w:r>
+          </w:p>
+          <w:p>
+            <w:pPr>
+              <w:spacing w:before="0" w:after="0" w:line="240" w:lineRule="auto"/>
+              <w:ind w:left="0" w:right="0" w:firstLine="0"/>
+              <w:jc w:val="left"/>
+            </w:pPr>
+            <w:r>
+              <w:rPr>
+                <w:rFonts w:ascii="Consolas" w:hAnsi="Consolas"/>
+                <w:sz w:val="18"/>
+              </w:rPr>
               <w:t>./scripts/generate-dev-cert.sh</w:t>
-              <w:br/>
+            </w:r>
+          </w:p>
+          <w:p>
+            <w:pPr>
+              <w:spacing w:before="0" w:after="0" w:line="240" w:lineRule="auto"/>
+              <w:ind w:left="0" w:right="0" w:firstLine="0"/>
+              <w:jc w:val="left"/>
+            </w:pPr>
+            <w:r>
+              <w:rPr>
+                <w:rFonts w:ascii="Consolas" w:hAnsi="Consolas"/>
+                <w:sz w:val="18"/>
+              </w:rPr>
               <w:t>docker compose pull</w:t>
-              <w:br/>
+            </w:r>
+          </w:p>
+          <w:p>
+            <w:pPr>
+              <w:spacing w:before="0" w:after="0" w:line="240" w:lineRule="auto"/>
+              <w:ind w:left="0" w:right="0" w:firstLine="0"/>
+              <w:jc w:val="left"/>
+            </w:pPr>
+            <w:r>
+              <w:rPr>
+                <w:rFonts w:ascii="Consolas" w:hAnsi="Consolas"/>
+                <w:sz w:val="18"/>
+              </w:rPr>
               <w:t>docker compose up -d</w:t>
-              <w:br/>
+            </w:r>
+          </w:p>
+          <w:p>
+            <w:pPr>
+              <w:spacing w:before="0" w:after="0" w:line="240" w:lineRule="auto"/>
+              <w:ind w:left="0" w:right="0" w:firstLine="0"/>
+              <w:jc w:val="left"/>
+            </w:pPr>
+            <w:r>
+              <w:rPr>
+                <w:rFonts w:ascii="Consolas" w:hAnsi="Consolas"/>
+                <w:sz w:val="18"/>
+              </w:rPr>
               <w:t>docker compose ps</w:t>
-              <w:br/>
+            </w:r>
+          </w:p>
+          <w:p>
+            <w:pPr>
+              <w:spacing w:before="0" w:after="0" w:line="240" w:lineRule="auto"/>
+              <w:ind w:left="0" w:right="0" w:firstLine="0"/>
+              <w:jc w:val="left"/>
+            </w:pPr>
+            <w:r>
+              <w:rPr>
+                <w:rFonts w:ascii="Consolas" w:hAnsi="Consolas"/>
+                <w:sz w:val="18"/>
+              </w:rPr>
               <w:t>docker compose logs -f wordpress-init</w:t>
             </w:r>
           </w:p>
@@ -2871,7 +3015,7 @@
                 <w:color w:val="000000"/>
                 <w:sz w:val="26"/>
               </w:rPr>
-              <w:t>WP_ADMIN_USER / WP_ADMIN_PASSWORD</w:t>
+              <w:t>admin / admin123@</w:t>
             </w:r>
           </w:p>
         </w:tc>
@@ -2963,7 +3107,7 @@
                 <w:color w:val="000000"/>
                 <w:sz w:val="26"/>
               </w:rPr>
-              <w:t>MYSQL_USER / MYSQL_PASSWORD</w:t>
+              <w:t>admin / admin123@</w:t>
             </w:r>
           </w:p>
         </w:tc>
@@ -3055,7 +3199,7 @@
                 <w:color w:val="000000"/>
                 <w:sz w:val="26"/>
               </w:rPr>
-              <w:t>Chỉ cục bộ</w:t>
+              <w:t>Không có đăng nhập (local)</w:t>
             </w:r>
           </w:p>
         </w:tc>
@@ -3147,12 +3291,20 @@
                 <w:color w:val="000000"/>
                 <w:sz w:val="26"/>
               </w:rPr>
-              <w:t>GRAFANA_ADMIN_USER / GRAFANA_ADMIN_PASSWORD</w:t>
+              <w:t>admin / admin123@</w:t>
             </w:r>
           </w:p>
         </w:tc>
       </w:tr>
     </w:tbl>
+    <w:p>
+      <w:pPr>
+        <w:spacing w:before="40" w:after="80"/>
+      </w:pPr>
+      <w:r>
+        <w:t>Thông tin đăng nhập mặc định cho bài tập local: WordPress, phpMyAdmin và Grafana dùng admin / admin123@; MySQL root dùng root / admin123@; MySQL Exporter dùng tài khoản nội bộ exporter / admin123@. Prometheus và Loki không cấu hình đăng nhập. Các mật khẩu demo được công khai trong .env.example, chỉ dùng trên máy local và cần thay trước khi triển khai công khai.</w:t>
+      </w:r>
+    </w:p>
     <w:p>
       <w:pPr>
         <w:spacing w:after="20"/>
@@ -3172,7 +3324,7 @@
           <w:color w:val="000000"/>
           <w:sz w:val="26"/>
         </w:rPr>
-        <w:t>docker compose down dừng dịch vụ và giữ dữ liệu trong named volumes. docker compose down -v xóa volumes và khởi tạo lại từ đầu. Sửa mật khẩu trong .env sau lần khởi tạo không tự cập nhật thông tin đăng nhập bên trong các dịch vụ.</w:t>
+        <w:t>docker compose down dừng dịch vụ và giữ dữ liệu trong named volumes. docker compose down -v xóa volumes và khởi tạo lại toàn bộ dữ liệu.</w:t>
       </w:r>
     </w:p>
     <w:p>
@@ -3338,7 +3490,7 @@
           <w:color w:val="000000"/>
           <w:sz w:val="26"/>
         </w:rPr>
-        <w:t>+ Mật khẩu lưu trong .env và không commit; thay mọi giá trị mẫu trước khi triển khai.</w:t>
+        <w:t>+ File .env thật không được commit. Mật khẩu demo admin / admin123@ nằm công khai trong .env.example; chỉ dùng trên máy local và phải đổi trước khi mở hệ thống ra Internet.</w:t>
       </w:r>
     </w:p>
     <w:p>
@@ -4178,7 +4330,7 @@
           <w:color w:val="000000"/>
           <w:sz w:val="26"/>
         </w:rPr>
-        <w:t>Sau khi chạy stack, mở Prometheus → Status → Targets để xác nhận scrape; Grafana → Dashboards → WordPress để quan sát dashboard. Báo cáo chưa ghi nhận ảnh chụp kết quả tại thời điểm soạn.</w:t>
+        <w:t>Stack đã được chạy bằng Docker Compose; trạng thái container và đăng nhập mới của WordPress, MySQL và Grafana đã được kiểm tra. Để hoàn thiện minh chứng, mở Prometheus → Status → Targets và Grafana → Dashboards → WordPress, sau đó chụp ảnh kết quả thực tế.</w:t>
       </w:r>
     </w:p>
     <w:p>
@@ -4384,7 +4536,7 @@
           <w:color w:val="000000"/>
           <w:sz w:val="26"/>
         </w:rPr>
-        <w:t>Các bước dưới đây là danh sách minh chứng theo rubric. Stack chưa được chạy trực tiếp trong quá trình soạn báo cáo nên chưa có kết quả runtime hoặc ảnh chụp được đính kèm; sau khi triển khai, chụp màn hình các nội dung sau.</w:t>
+        <w:t>Các bước dưới đây là danh sách minh chứng theo rubric. Stack đã được chạy và kiểm tra, nhưng báo cáo chưa đính kèm ảnh chụp runtime; cần chụp màn hình các nội dung sau từ chính máy triển khai.</w:t>
       </w:r>
     </w:p>
     <w:p>
@@ -4910,7 +5062,7 @@
           <w:color w:val="000000"/>
           <w:sz w:val="26"/>
         </w:rPr>
-        <w:t>Trước khi nộp, cần chạy stack để bổ sung ảnh minh chứng, công bố mã nguồn lên GitHub và ghi URL repository. Hướng phát triển tiếp theo là thay chứng chỉ demo bằng TLS hợp lệ, bổ sung cảnh báo vận hành và chuyển Promtail sang Alloy.</w:t>
+        <w:t>Trước khi nộp, cần bổ sung ảnh minh chứng chụp từ hệ thống và ghi URL repository https://github.com/Study332/DTC245010044_De3_WordPress. Hướng phát triển tiếp theo là thay chứng chỉ demo bằng TLS hợp lệ, bổ sung cảnh báo vận hành và chuyển Promtail sang Alloy.</w:t>
       </w:r>
     </w:p>
     <w:p>

</xml_diff>

<commit_message>
Add runtime evidence to WordPress report
</commit_message>
<xml_diff>
--- a/Bai_lam_De3_WordPress/Bao_cao_De_3_WordPress.docx
+++ b/Bai_lam_De3_WordPress/Bao_cao_De_3_WordPress.docx
@@ -503,7 +503,7 @@
         </w:rPr>
         <w:t>2.3. Khởi tạo dữ liệu</w:t>
         <w:tab/>
-        <w:t>4</w:t>
+        <w:t>5</w:t>
       </w:r>
     </w:p>
     <w:p>
@@ -523,7 +523,7 @@
         </w:rPr>
         <w:t>2.4. Quy trình cài đặt và vận hành</w:t>
         <w:tab/>
-        <w:t>5</w:t>
+        <w:t>6</w:t>
       </w:r>
     </w:p>
     <w:p>
@@ -543,7 +543,7 @@
         </w:rPr>
         <w:t>PHẦN 3: REVERSE PROXY VÀ BẢO MẬT HỆ THỐNG</w:t>
         <w:tab/>
-        <w:t>6</w:t>
+        <w:t>7</w:t>
       </w:r>
     </w:p>
     <w:p>
@@ -563,7 +563,7 @@
         </w:rPr>
         <w:t>3.1. Cấu hình Nginx HTTPS</w:t>
         <w:tab/>
-        <w:t>6</w:t>
+        <w:t>7</w:t>
       </w:r>
     </w:p>
     <w:p>
@@ -583,7 +583,7 @@
         </w:rPr>
         <w:t>3.2. Các biện pháp security hardening</w:t>
         <w:tab/>
-        <w:t>6</w:t>
+        <w:t>7</w:t>
       </w:r>
     </w:p>
     <w:p>
@@ -603,7 +603,7 @@
         </w:rPr>
         <w:t>PHẦN 4: GIÁM SÁT VÀ QUẢN LÝ LOG TẬP TRUNG</w:t>
         <w:tab/>
-        <w:t>7</w:t>
+        <w:t>9</w:t>
       </w:r>
     </w:p>
     <w:p>
@@ -623,7 +623,7 @@
         </w:rPr>
         <w:t>4.1. Prometheus và Grafana</w:t>
         <w:tab/>
-        <w:t>7</w:t>
+        <w:t>9</w:t>
       </w:r>
     </w:p>
     <w:p>
@@ -643,7 +643,7 @@
         </w:rPr>
         <w:t>4.2. Loki và Promtail</w:t>
         <w:tab/>
-        <w:t>8</w:t>
+        <w:t>11</w:t>
       </w:r>
     </w:p>
     <w:p>
@@ -661,9 +661,9 @@
           <w:color w:val="000000"/>
           <w:sz w:val="26"/>
         </w:rPr>
-        <w:t>4.3. Kiểm tra và minh chứng cần bổ sung</w:t>
+        <w:t>4.3. Tổng hợp kiểm tra và minh chứng runtime</w:t>
         <w:tab/>
-        <w:t>9</w:t>
+        <w:t>12</w:t>
       </w:r>
     </w:p>
     <w:p>
@@ -683,7 +683,7 @@
         </w:rPr>
         <w:t>KẾT LUẬN VÀ HƯỚNG PHÁT TRIỂN</w:t>
         <w:tab/>
-        <w:t>9</w:t>
+        <w:t>12</w:t>
       </w:r>
     </w:p>
     <w:p>
@@ -703,7 +703,7 @@
         </w:rPr>
         <w:t>TÀI LIỆU THAM KHẢO</w:t>
         <w:tab/>
-        <w:t>10</w:t>
+        <w:t>14</w:t>
       </w:r>
     </w:p>
     <w:p>
@@ -765,7 +765,7 @@
         </w:rPr>
         <w:t>Bảng 2.1: Địa chỉ truy cập và thông tin đăng nhập</w:t>
         <w:tab/>
-        <w:t>5</w:t>
+        <w:t>6</w:t>
       </w:r>
     </w:p>
     <w:p>
@@ -785,7 +785,7 @@
         </w:rPr>
         <w:t>Bảng 4.1: Các nguồn metrics được Prometheus scrape</w:t>
         <w:tab/>
-        <w:t>7</w:t>
+        <w:t>9</w:t>
       </w:r>
     </w:p>
     <w:p>
@@ -803,9 +803,9 @@
           <w:color w:val="000000"/>
           <w:sz w:val="26"/>
         </w:rPr>
-        <w:t>Bảng 4.2: Danh sách minh chứng kiểm tra</w:t>
+        <w:t>Bảng 4.2: Các nội dung minh chứng đã kiểm tra</w:t>
         <w:tab/>
-        <w:t>9</w:t>
+        <w:t>12</w:t>
       </w:r>
     </w:p>
     <w:p>
@@ -840,9 +840,107 @@
           <w:color w:val="000000"/>
           <w:sz w:val="26"/>
         </w:rPr>
-        <w:t>Hình 1.1: Kiến trúc hệ thống website Nương và dịch vụ quan sát</w:t>
+        <w:t>Hình 1.1: Kiến trúc tổng thể hệ thống các container Docker</w:t>
         <w:tab/>
         <w:t>2</w:t>
+      </w:r>
+    </w:p>
+    <w:p>
+      <w:pPr>
+        <w:tabs>
+          <w:tab w:pos="9144" w:val="right" w:leader="dot"/>
+        </w:tabs>
+        <w:spacing w:after="80" w:line="259" w:lineRule="auto"/>
+        <w:ind w:firstLine="0"/>
+      </w:pPr>
+      <w:r>
+        <w:t>Hình 2.1: Giao diện quản lý mã nguồn dự án trên GitHub</w:t>
+        <w:tab/>
+        <w:t>4</w:t>
+      </w:r>
+    </w:p>
+    <w:p>
+      <w:pPr>
+        <w:tabs>
+          <w:tab w:pos="9144" w:val="right" w:leader="dot"/>
+        </w:tabs>
+        <w:spacing w:after="80" w:line="259" w:lineRule="auto"/>
+        <w:ind w:firstLine="0"/>
+      </w:pPr>
+      <w:r>
+        <w:t>Hình 2.2: Trang chủ WordPress với các sản phẩm cà phê</w:t>
+        <w:tab/>
+        <w:t>5</w:t>
+      </w:r>
+    </w:p>
+    <w:p>
+      <w:pPr>
+        <w:tabs>
+          <w:tab w:pos="9144" w:val="right" w:leader="dot"/>
+        </w:tabs>
+        <w:spacing w:after="80" w:line="259" w:lineRule="auto"/>
+        <w:ind w:firstLine="0"/>
+      </w:pPr>
+      <w:r>
+        <w:t>Hình 2.3: CSDL WordPress và 12 bảng trong phpMyAdmin</w:t>
+        <w:tab/>
+        <w:t>5</w:t>
+      </w:r>
+    </w:p>
+    <w:p>
+      <w:pPr>
+        <w:tabs>
+          <w:tab w:pos="9144" w:val="right" w:leader="dot"/>
+        </w:tabs>
+        <w:spacing w:after="80" w:line="259" w:lineRule="auto"/>
+        <w:ind w:firstLine="0"/>
+      </w:pPr>
+      <w:r>
+        <w:t>Hình 3.1: Cấu hình Reverse Proxy HTTPS và security headers trong Nginx</w:t>
+        <w:tab/>
+        <w:t>7</w:t>
+      </w:r>
+    </w:p>
+    <w:p>
+      <w:pPr>
+        <w:tabs>
+          <w:tab w:pos="9144" w:val="right" w:leader="dot"/>
+        </w:tabs>
+        <w:spacing w:after="80" w:line="259" w:lineRule="auto"/>
+        <w:ind w:firstLine="0"/>
+      </w:pPr>
+      <w:r>
+        <w:t>Hình 4.1: Trạng thái 4 target dịch vụ UP và target tự giám sát Prometheus</w:t>
+        <w:tab/>
+        <w:t>10</w:t>
+      </w:r>
+    </w:p>
+    <w:p>
+      <w:pPr>
+        <w:tabs>
+          <w:tab w:pos="9144" w:val="right" w:leader="dot"/>
+        </w:tabs>
+        <w:spacing w:after="80" w:line="259" w:lineRule="auto"/>
+        <w:ind w:firstLine="0"/>
+      </w:pPr>
+      <w:r>
+        <w:t>Hình 4.2: Dashboard Grafana với metrics WordPress và hạ tầng</w:t>
+        <w:tab/>
+        <w:t>10</w:t>
+      </w:r>
+    </w:p>
+    <w:p>
+      <w:pPr>
+        <w:tabs>
+          <w:tab w:pos="9144" w:val="right" w:leader="dot"/>
+        </w:tabs>
+        <w:spacing w:after="80" w:line="259" w:lineRule="auto"/>
+        <w:ind w:firstLine="0"/>
+      </w:pPr>
+      <w:r>
+        <w:t>Hình 4.3: Kết quả truy vấn LogQL trong Grafana Explore</w:t>
+        <w:tab/>
+        <w:t>11</w:t>
       </w:r>
     </w:p>
     <w:p>
@@ -939,7 +1037,7 @@
           <w:color w:val="000000"/>
           <w:sz w:val="26"/>
         </w:rPr>
-        <w:t>Em xin chân thành cảm ơn giảng viên phụ trách học phần đã hướng dẫn và tạo điều kiện để em thực hiện đề tài. Báo cáo được xây dựng từ mã nguồn và cấu hình hiện có; phần ảnh chụp kiểm thử thực tế sẽ được bổ sung sau khi chạy stack trên môi trường Docker.</w:t>
+        <w:t>Em xin chân thành cảm ơn giảng viên phụ trách học phần đã hướng dẫn và tạo điều kiện để em thực hiện đề tài. Báo cáo được xây dựng từ mã nguồn và cấu hình hiện có, đồng thời bổ sung ảnh chụp thực tế từ website và các giao diện quản trị, giám sát khi stack chạy trên Docker.</w:t>
       </w:r>
     </w:p>
     <w:p>
@@ -1152,7 +1250,7 @@
           <w:color w:val="000000"/>
           <w:sz w:val="26"/>
         </w:rPr>
-        <w:t>Hình 1.1: Kiến trúc hệ thống website Nương và dịch vụ quan sát</w:t>
+        <w:t>Hình 1.1: Kiến trúc tổng thể hệ thống các container Docker.</w:t>
       </w:r>
     </w:p>
     <w:p>
@@ -2400,6 +2498,63 @@
     </w:p>
     <w:p>
       <w:pPr>
+        <w:keepNext/>
+        <w:spacing w:before="80" w:after="0"/>
+        <w:jc w:val="center"/>
+      </w:pPr>
+      <w:r>
+        <w:drawing>
+          <wp:inline xmlns:a="http://schemas.openxmlformats.org/drawingml/2006/main" xmlns:pic="http://schemas.openxmlformats.org/drawingml/2006/picture">
+            <wp:extent cx="5486400" cy="3087998"/>
+            <wp:docPr id="3" name="Picture 3" descr="Trang repository GitHub của dự án WordPress, hiển thị mã nguồn và lịch sử commit."/>
+            <wp:cNvGraphicFramePr>
+              <a:graphicFrameLocks noChangeAspect="1"/>
+            </wp:cNvGraphicFramePr>
+            <a:graphic>
+              <a:graphicData uri="http://schemas.openxmlformats.org/drawingml/2006/picture">
+                <pic:pic>
+                  <pic:nvPicPr>
+                    <pic:cNvPr id="0" name="02-github-repo.jpg"/>
+                    <pic:cNvPicPr/>
+                  </pic:nvPicPr>
+                  <pic:blipFill>
+                    <a:blip r:embed="rId16"/>
+                    <a:stretch>
+                      <a:fillRect/>
+                    </a:stretch>
+                  </pic:blipFill>
+                  <pic:spPr>
+                    <a:xfrm>
+                      <a:off x="0" y="0"/>
+                      <a:ext cx="5486400" cy="3087998"/>
+                    </a:xfrm>
+                    <a:prstGeom prst="rect"/>
+                  </pic:spPr>
+                </pic:pic>
+              </a:graphicData>
+            </a:graphic>
+          </wp:inline>
+        </w:drawing>
+      </w:r>
+    </w:p>
+    <w:p>
+      <w:pPr>
+        <w:tabs>
+          <w:tab w:pos="9144" w:val="right" w:leader="dot"/>
+        </w:tabs>
+        <w:spacing w:after="80" w:line="259" w:lineRule="auto"/>
+        <w:ind w:firstLine="0"/>
+      </w:pPr>
+      <w:r>
+        <w:rPr>
+          <w:i/>
+          <w:sz w:val="18"/>
+        </w:rPr>
+        <w:t>Hình 2.1: Giao diện quản lý mã nguồn dự án trên GitHub.</w:t>
+      </w:r>
+    </w:p>
+    <w:p>
+      <w:pPr>
         <w:pStyle w:val="Heading2"/>
         <w:keepNext/>
         <w:spacing w:before="140" w:after="120"/>
@@ -2480,6 +2635,63 @@
     </w:p>
     <w:p>
       <w:pPr>
+        <w:keepNext/>
+        <w:spacing w:before="80" w:after="0"/>
+        <w:jc w:val="center"/>
+      </w:pPr>
+      <w:r>
+        <w:drawing>
+          <wp:inline xmlns:a="http://schemas.openxmlformats.org/drawingml/2006/main" xmlns:pic="http://schemas.openxmlformats.org/drawingml/2006/picture">
+            <wp:extent cx="5486400" cy="3087998"/>
+            <wp:docPr id="4" name="Picture 4" descr="Trang chủ website Nương với các thẻ sản phẩm cà phê."/>
+            <wp:cNvGraphicFramePr>
+              <a:graphicFrameLocks noChangeAspect="1"/>
+            </wp:cNvGraphicFramePr>
+            <a:graphic>
+              <a:graphicData uri="http://schemas.openxmlformats.org/drawingml/2006/picture">
+                <pic:pic>
+                  <pic:nvPicPr>
+                    <pic:cNvPr id="0" name="05-website-products.jpg"/>
+                    <pic:cNvPicPr/>
+                  </pic:nvPicPr>
+                  <pic:blipFill>
+                    <a:blip r:embed="rId17"/>
+                    <a:stretch>
+                      <a:fillRect/>
+                    </a:stretch>
+                  </pic:blipFill>
+                  <pic:spPr>
+                    <a:xfrm>
+                      <a:off x="0" y="0"/>
+                      <a:ext cx="5486400" cy="3087998"/>
+                    </a:xfrm>
+                    <a:prstGeom prst="rect"/>
+                  </pic:spPr>
+                </pic:pic>
+              </a:graphicData>
+            </a:graphic>
+          </wp:inline>
+        </w:drawing>
+      </w:r>
+    </w:p>
+    <w:p>
+      <w:pPr>
+        <w:tabs>
+          <w:tab w:pos="9144" w:val="right" w:leader="dot"/>
+        </w:tabs>
+        <w:spacing w:after="80" w:line="259" w:lineRule="auto"/>
+        <w:ind w:firstLine="0"/>
+      </w:pPr>
+      <w:r>
+        <w:rPr>
+          <w:i/>
+          <w:sz w:val="18"/>
+        </w:rPr>
+        <w:t>Hình 2.2: Trang chủ WordPress Nương hiển thị các sản phẩm cà phê.</w:t>
+      </w:r>
+    </w:p>
+    <w:p>
+      <w:pPr>
         <w:pStyle w:val="Heading2"/>
         <w:keepNext/>
         <w:spacing w:before="140" w:after="120"/>
@@ -2511,6 +2723,65 @@
           <w:sz w:val="26"/>
         </w:rPr>
         <w:t>Biến SITE_URL mặc định là https://localhost. Tài khoản và mật khẩu được lấy từ .env. Với volume đã khởi tạo, đổi giá trị trong .env không tự cập nhật mật khẩu đã lưu trong WordPress, MySQL hoặc Grafana; cần đổi trực tiếp trong dịch vụ tương ứng.</w:t>
+      </w:r>
+    </w:p>
+    <w:p>
+      <w:pPr>
+        <w:keepNext/>
+        <w:spacing w:before="80" w:after="0"/>
+        <w:jc w:val="center"/>
+      </w:pPr>
+      <w:r>
+        <w:drawing>
+          <wp:inline xmlns:a="http://schemas.openxmlformats.org/drawingml/2006/main" xmlns:pic="http://schemas.openxmlformats.org/drawingml/2006/picture">
+            <wp:extent cx="5486400" cy="3087998"/>
+            <wp:docPr id="5" name="Picture 5" descr="phpMyAdmin hiển thị database wordpress_db và danh sách 12 bảng WordPress."/>
+            <wp:cNvGraphicFramePr>
+              <a:graphicFrameLocks noChangeAspect="1"/>
+            </wp:cNvGraphicFramePr>
+            <a:graphic>
+              <a:graphicData uri="http://schemas.openxmlformats.org/drawingml/2006/picture">
+                <pic:pic>
+                  <pic:nvPicPr>
+                    <pic:cNvPr id="0" name="08-phpmyadmin-database.jpg"/>
+                    <pic:cNvPicPr/>
+                  </pic:nvPicPr>
+                  <pic:blipFill>
+                    <a:blip r:embed="rId18"/>
+                    <a:stretch>
+                      <a:fillRect/>
+                    </a:stretch>
+                  </pic:blipFill>
+                  <pic:spPr>
+                    <a:xfrm>
+                      <a:off x="0" y="0"/>
+                      <a:ext cx="5486400" cy="3087998"/>
+                    </a:xfrm>
+                    <a:prstGeom prst="rect"/>
+                  </pic:spPr>
+                </pic:pic>
+              </a:graphicData>
+            </a:graphic>
+          </wp:inline>
+        </w:drawing>
+      </w:r>
+    </w:p>
+    <w:p>
+      <w:pPr>
+        <w:tabs>
+          <w:tab w:pos="9144" w:val="right" w:leader="dot"/>
+        </w:tabs>
+        <w:spacing w:after="80" w:line="259" w:lineRule="auto"/>
+        <w:ind w:firstLine="0"/>
+      </w:pPr>
+      <w:r>
+        <w:rPr>
+          <w:i/>
+          <w:sz w:val="18"/>
+        </w:rPr>
+        <w:t>Hình 2.3: CSDL WordPress và 12 bảng trong phpMyAdmin</w:t>
+        <w:tab/>
+        <w:t>5</w:t>
       </w:r>
     </w:p>
     <w:p>
@@ -3432,6 +3703,63 @@
     </w:p>
     <w:p>
       <w:pPr>
+        <w:keepNext/>
+        <w:spacing w:before="80" w:after="0"/>
+        <w:jc w:val="center"/>
+      </w:pPr>
+      <w:r>
+        <w:drawing>
+          <wp:inline xmlns:a="http://schemas.openxmlformats.org/drawingml/2006/main" xmlns:pic="http://schemas.openxmlformats.org/drawingml/2006/picture">
+            <wp:extent cx="5486400" cy="3087998"/>
+            <wp:docPr id="6" name="Picture 6" descr="Tệp cấu hình Nginx trên GitHub gồm lắng nghe HTTPS, proxy pass và security headers."/>
+            <wp:cNvGraphicFramePr>
+              <a:graphicFrameLocks noChangeAspect="1"/>
+            </wp:cNvGraphicFramePr>
+            <a:graphic>
+              <a:graphicData uri="http://schemas.openxmlformats.org/drawingml/2006/picture">
+                <pic:pic>
+                  <pic:nvPicPr>
+                    <pic:cNvPr id="0" name="03-nginx-https-config.jpg"/>
+                    <pic:cNvPicPr/>
+                  </pic:nvPicPr>
+                  <pic:blipFill>
+                    <a:blip r:embed="rId19"/>
+                    <a:stretch>
+                      <a:fillRect/>
+                    </a:stretch>
+                  </pic:blipFill>
+                  <pic:spPr>
+                    <a:xfrm>
+                      <a:off x="0" y="0"/>
+                      <a:ext cx="5486400" cy="3087998"/>
+                    </a:xfrm>
+                    <a:prstGeom prst="rect"/>
+                  </pic:spPr>
+                </pic:pic>
+              </a:graphicData>
+            </a:graphic>
+          </wp:inline>
+        </w:drawing>
+      </w:r>
+    </w:p>
+    <w:p>
+      <w:pPr>
+        <w:tabs>
+          <w:tab w:pos="9144" w:val="right" w:leader="dot"/>
+        </w:tabs>
+        <w:spacing w:after="80" w:line="259" w:lineRule="auto"/>
+        <w:ind w:firstLine="0"/>
+      </w:pPr>
+      <w:r>
+        <w:rPr>
+          <w:i/>
+          <w:sz w:val="18"/>
+        </w:rPr>
+        <w:t>Hình 3.1: Cấu hình Reverse Proxy HTTPS và security headers trong Nginx.</w:t>
+      </w:r>
+    </w:p>
+    <w:p>
+      <w:pPr>
         <w:pStyle w:val="Heading2"/>
         <w:keepNext/>
         <w:spacing w:before="140" w:after="120"/>
@@ -4330,7 +4658,121 @@
           <w:color w:val="000000"/>
           <w:sz w:val="26"/>
         </w:rPr>
-        <w:t>Stack đã được chạy bằng Docker Compose; trạng thái container và đăng nhập mới của WordPress, MySQL và Grafana đã được kiểm tra. Để hoàn thiện minh chứng, mở Prometheus → Status → Targets và Grafana → Dashboards → WordPress, sau đó chụp ảnh kết quả thực tế.</w:t>
+        <w:t>Khi kiểm tra runtime, các dịch vụ ứng dụng, cơ sở dữ liệu, reverse proxy và công cụ quan sát đã khởi chạy; MySQL và cAdvisor báo healthy. Prometheus hiển thị đủ 5 job ở trạng thái UP (4 exporter và job tự giám sát Prometheus). Dashboard Grafana đã có dữ liệu CPU/RAM container, kết nối Nginx và truy vấn MySQL; ảnh minh chứng được trình bày tại Hình 4.1 và Hình 4.2.</w:t>
+      </w:r>
+    </w:p>
+    <w:p>
+      <w:pPr>
+        <w:keepNext/>
+        <w:spacing w:before="80" w:after="0"/>
+        <w:jc w:val="center"/>
+      </w:pPr>
+      <w:r>
+        <w:drawing>
+          <wp:inline xmlns:a="http://schemas.openxmlformats.org/drawingml/2006/main" xmlns:pic="http://schemas.openxmlformats.org/drawingml/2006/picture">
+            <wp:extent cx="4663440" cy="3763931"/>
+            <wp:docPr id="7" name="Picture 7" descr="Prometheus Targets hiển thị cả năm job scrape ở trạng thái UP."/>
+            <wp:cNvGraphicFramePr>
+              <a:graphicFrameLocks noChangeAspect="1"/>
+            </wp:cNvGraphicFramePr>
+            <a:graphic>
+              <a:graphicData uri="http://schemas.openxmlformats.org/drawingml/2006/picture">
+                <pic:pic>
+                  <pic:nvPicPr>
+                    <pic:cNvPr id="0" name="04-prometheus-targets.jpg"/>
+                    <pic:cNvPicPr/>
+                  </pic:nvPicPr>
+                  <pic:blipFill>
+                    <a:blip r:embed="rId20"/>
+                    <a:stretch>
+                      <a:fillRect/>
+                    </a:stretch>
+                  </pic:blipFill>
+                  <pic:spPr>
+                    <a:xfrm>
+                      <a:off x="0" y="0"/>
+                      <a:ext cx="4663440" cy="3763931"/>
+                    </a:xfrm>
+                    <a:prstGeom prst="rect"/>
+                  </pic:spPr>
+                </pic:pic>
+              </a:graphicData>
+            </a:graphic>
+          </wp:inline>
+        </w:drawing>
+      </w:r>
+    </w:p>
+    <w:p>
+      <w:pPr>
+        <w:tabs>
+          <w:tab w:pos="9144" w:val="right" w:leader="dot"/>
+        </w:tabs>
+        <w:spacing w:after="80" w:line="259" w:lineRule="auto"/>
+        <w:ind w:firstLine="0"/>
+      </w:pPr>
+      <w:r>
+        <w:rPr>
+          <w:i/>
+          <w:sz w:val="18"/>
+        </w:rPr>
+        <w:t>Hình 4.1: Trạng thái 4 target dịch vụ UP và target tự giám sát Prometheus.</w:t>
+      </w:r>
+    </w:p>
+    <w:p>
+      <w:pPr>
+        <w:keepNext/>
+        <w:spacing w:before="80" w:after="0"/>
+        <w:jc w:val="center"/>
+      </w:pPr>
+      <w:r>
+        <w:drawing>
+          <wp:inline xmlns:a="http://schemas.openxmlformats.org/drawingml/2006/main" xmlns:pic="http://schemas.openxmlformats.org/drawingml/2006/picture">
+            <wp:extent cx="5486400" cy="3086100"/>
+            <wp:docPr id="8" name="Picture 8" descr="Grafana dashboard có biểu đồ CPU, RAM, kết nối Nginx, MySQL uptime và tốc độ truy vấn."/>
+            <wp:cNvGraphicFramePr>
+              <a:graphicFrameLocks noChangeAspect="1"/>
+            </wp:cNvGraphicFramePr>
+            <a:graphic>
+              <a:graphicData uri="http://schemas.openxmlformats.org/drawingml/2006/picture">
+                <pic:pic>
+                  <pic:nvPicPr>
+                    <pic:cNvPr id="0" name="06-grafana-dashboard.jpg"/>
+                    <pic:cNvPicPr/>
+                  </pic:nvPicPr>
+                  <pic:blipFill>
+                    <a:blip r:embed="rId21"/>
+                    <a:stretch>
+                      <a:fillRect/>
+                    </a:stretch>
+                  </pic:blipFill>
+                  <pic:spPr>
+                    <a:xfrm>
+                      <a:off x="0" y="0"/>
+                      <a:ext cx="5486400" cy="3086100"/>
+                    </a:xfrm>
+                    <a:prstGeom prst="rect"/>
+                  </pic:spPr>
+                </pic:pic>
+              </a:graphicData>
+            </a:graphic>
+          </wp:inline>
+        </w:drawing>
+      </w:r>
+    </w:p>
+    <w:p>
+      <w:pPr>
+        <w:tabs>
+          <w:tab w:pos="9144" w:val="right" w:leader="dot"/>
+        </w:tabs>
+        <w:spacing w:after="80" w:line="259" w:lineRule="auto"/>
+        <w:ind w:firstLine="0"/>
+      </w:pPr>
+      <w:r>
+        <w:rPr>
+          <w:i/>
+          <w:sz w:val="18"/>
+        </w:rPr>
+        <w:t>Hình 4.2: Dashboard Grafana với metrics WordPress và hạ tầng.</w:t>
       </w:r>
     </w:p>
     <w:p>
@@ -4458,6 +4900,63 @@
     </w:p>
     <w:p>
       <w:pPr>
+        <w:keepNext/>
+        <w:spacing w:before="80" w:after="0"/>
+        <w:jc w:val="center"/>
+      </w:pPr>
+      <w:r>
+        <w:drawing>
+          <wp:inline xmlns:a="http://schemas.openxmlformats.org/drawingml/2006/main" xmlns:pic="http://schemas.openxmlformats.org/drawingml/2006/picture">
+            <wp:extent cx="5486400" cy="3086100"/>
+            <wp:docPr id="9" name="Picture 9" descr="Grafana Explore chạy truy vấn {job=&quot;docker&quot;} và trả về log container."/>
+            <wp:cNvGraphicFramePr>
+              <a:graphicFrameLocks noChangeAspect="1"/>
+            </wp:cNvGraphicFramePr>
+            <a:graphic>
+              <a:graphicData uri="http://schemas.openxmlformats.org/drawingml/2006/picture">
+                <pic:pic>
+                  <pic:nvPicPr>
+                    <pic:cNvPr id="0" name="07-grafana-logql.jpg"/>
+                    <pic:cNvPicPr/>
+                  </pic:nvPicPr>
+                  <pic:blipFill>
+                    <a:blip r:embed="rId22"/>
+                    <a:stretch>
+                      <a:fillRect/>
+                    </a:stretch>
+                  </pic:blipFill>
+                  <pic:spPr>
+                    <a:xfrm>
+                      <a:off x="0" y="0"/>
+                      <a:ext cx="5486400" cy="3086100"/>
+                    </a:xfrm>
+                    <a:prstGeom prst="rect"/>
+                  </pic:spPr>
+                </pic:pic>
+              </a:graphicData>
+            </a:graphic>
+          </wp:inline>
+        </w:drawing>
+      </w:r>
+    </w:p>
+    <w:p>
+      <w:pPr>
+        <w:tabs>
+          <w:tab w:pos="9144" w:val="right" w:leader="dot"/>
+        </w:tabs>
+        <w:spacing w:after="80" w:line="259" w:lineRule="auto"/>
+        <w:ind w:firstLine="0"/>
+      </w:pPr>
+      <w:r>
+        <w:rPr>
+          <w:i/>
+          <w:sz w:val="18"/>
+        </w:rPr>
+        <w:t>Hình 4.3: Kết quả truy vấn LogQL trong Grafana Explore.</w:t>
+      </w:r>
+    </w:p>
+    <w:p>
+      <w:pPr>
         <w:spacing w:after="120" w:before="0" w:line="312" w:lineRule="auto"/>
         <w:ind w:firstLine="680"/>
         <w:jc w:val="both"/>
@@ -4519,7 +5018,7 @@
           <w:color w:val="000000"/>
           <w:sz w:val="28"/>
         </w:rPr>
-        <w:t>4.3. Kiểm tra và minh chứng cần bổ sung</w:t>
+        <w:t>4.3. Tổng hợp kiểm tra và minh chứng runtime</w:t>
       </w:r>
     </w:p>
     <w:p>
@@ -4536,7 +5035,7 @@
           <w:color w:val="000000"/>
           <w:sz w:val="26"/>
         </w:rPr>
-        <w:t>Các bước dưới đây là danh sách minh chứng theo rubric. Stack đã được chạy và kiểm tra, nhưng báo cáo chưa đính kèm ảnh chụp runtime; cần chụp màn hình các nội dung sau từ chính máy triển khai.</w:t>
+        <w:t>Các nội dung trong bảng dưới đây đã được đối chiếu khi chạy stack. Ảnh chụp thực tế được chèn tại mục tương ứng trong báo cáo và lưu kèm trong thư mục Bai_lam_De3_WordPress/minh-chung để tiện tra cứu.</w:t>
       </w:r>
     </w:p>
     <w:p>
@@ -4553,7 +5052,7 @@
           <w:color w:val="000000"/>
           <w:sz w:val="26"/>
         </w:rPr>
-        <w:t>Bảng 4.2: Danh sách minh chứng kiểm tra</w:t>
+        <w:t>Bảng 4.2: Các nội dung minh chứng đã kiểm tra</w:t>
       </w:r>
     </w:p>
     <w:tbl>
@@ -4564,13 +5063,13 @@
         <w:tblLook w:firstColumn="1" w:firstRow="1" w:lastColumn="0" w:lastRow="0" w:noHBand="0" w:noVBand="1" w:val="04A0"/>
       </w:tblPr>
       <w:tblGrid>
-        <w:gridCol w:w="2232"/>
-        <w:gridCol w:w="7056"/>
+        <w:gridCol w:w="2376"/>
+        <w:gridCol w:w="6624"/>
       </w:tblGrid>
       <w:tr>
         <w:tc>
           <w:tcPr>
-            <w:tcW w:type="dxa" w:w="2232"/>
+            <w:tcW w:type="dxa" w:w="2376"/>
             <w:vAlign w:val="center"/>
             <w:shd w:fill="E6E6E6"/>
             <w:tcBorders>
@@ -4583,24 +5082,14 @@
             </w:tcBorders>
           </w:tcPr>
           <w:p>
-            <w:pPr>
-              <w:spacing w:after="0" w:line="240" w:lineRule="auto"/>
-              <w:jc w:val="center"/>
-            </w:pPr>
             <w:r>
-              <w:rPr>
-                <w:rFonts w:ascii="Times New Roman" w:hAnsi="Times New Roman"/>
-                <w:b/>
-                <w:color w:val="000000"/>
-                <w:sz w:val="26"/>
-              </w:rPr>
               <w:t>Minh chứng</w:t>
             </w:r>
           </w:p>
         </w:tc>
         <w:tc>
           <w:tcPr>
-            <w:tcW w:type="dxa" w:w="7056"/>
+            <w:tcW w:type="dxa" w:w="6624"/>
             <w:vAlign w:val="center"/>
             <w:shd w:fill="E6E6E6"/>
             <w:tcBorders>
@@ -4613,18 +5102,8 @@
             </w:tcBorders>
           </w:tcPr>
           <w:p>
-            <w:pPr>
-              <w:spacing w:after="0" w:line="240" w:lineRule="auto"/>
-              <w:jc w:val="center"/>
-            </w:pPr>
             <w:r>
-              <w:rPr>
-                <w:rFonts w:ascii="Times New Roman" w:hAnsi="Times New Roman"/>
-                <w:b/>
-                <w:color w:val="000000"/>
-                <w:sz w:val="26"/>
-              </w:rPr>
-              <w:t>Nội dung cần thể hiện</w:t>
+              <w:t>Nội dung đã kiểm tra</w:t>
             </w:r>
           </w:p>
         </w:tc>
@@ -4635,7 +5114,7 @@
         </w:trPr>
         <w:tc>
           <w:tcPr>
-            <w:tcW w:type="dxa" w:w="2232"/>
+            <w:tcW w:type="dxa" w:w="2376"/>
             <w:vAlign w:val="center"/>
             <w:tcBorders>
               <w:top w:val="single" w:sz="5" w:color="777777"/>
@@ -4647,24 +5126,14 @@
             </w:tcBorders>
           </w:tcPr>
           <w:p>
-            <w:pPr>
-              <w:spacing w:after="0" w:line="240" w:lineRule="auto"/>
-              <w:ind w:firstLine="0"/>
-              <w:jc w:val="left"/>
-            </w:pPr>
             <w:r>
-              <w:rPr>
-                <w:rFonts w:ascii="Times New Roman" w:hAnsi="Times New Roman"/>
-                <w:color w:val="000000"/>
-                <w:sz w:val="26"/>
-              </w:rPr>
-              <w:t>Website</w:t>
+              <w:t>GitHub repo</w:t>
             </w:r>
           </w:p>
         </w:tc>
         <w:tc>
           <w:tcPr>
-            <w:tcW w:type="dxa" w:w="7056"/>
+            <w:tcW w:type="dxa" w:w="6624"/>
             <w:vAlign w:val="center"/>
             <w:tcBorders>
               <w:top w:val="single" w:sz="5" w:color="777777"/>
@@ -4676,18 +5145,8 @@
             </w:tcBorders>
           </w:tcPr>
           <w:p>
-            <w:pPr>
-              <w:spacing w:after="0" w:line="240" w:lineRule="auto"/>
-              <w:ind w:firstLine="0"/>
-              <w:jc w:val="left"/>
-            </w:pPr>
             <w:r>
-              <w:rPr>
-                <w:rFonts w:ascii="Times New Roman" w:hAnsi="Times New Roman"/>
-                <w:color w:val="000000"/>
-                <w:sz w:val="26"/>
-              </w:rPr>
-              <w:t>Trang Nương qua HTTPS và ba sản phẩm mẫu.</w:t>
+              <w:t>Repository dự án và lịch sử commit; xem Hình 2.1.</w:t>
             </w:r>
           </w:p>
         </w:tc>
@@ -4698,7 +5157,7 @@
         </w:trPr>
         <w:tc>
           <w:tcPr>
-            <w:tcW w:type="dxa" w:w="2232"/>
+            <w:tcW w:type="dxa" w:w="2376"/>
             <w:vAlign w:val="center"/>
             <w:tcBorders>
               <w:top w:val="single" w:sz="5" w:color="777777"/>
@@ -4710,24 +5169,14 @@
             </w:tcBorders>
           </w:tcPr>
           <w:p>
-            <w:pPr>
-              <w:spacing w:after="0" w:line="240" w:lineRule="auto"/>
-              <w:ind w:firstLine="0"/>
-              <w:jc w:val="left"/>
-            </w:pPr>
             <w:r>
-              <w:rPr>
-                <w:rFonts w:ascii="Times New Roman" w:hAnsi="Times New Roman"/>
-                <w:color w:val="000000"/>
-                <w:sz w:val="26"/>
-              </w:rPr>
-              <w:t>Docker Compose</w:t>
+              <w:t>Website</w:t>
             </w:r>
           </w:p>
         </w:tc>
         <w:tc>
           <w:tcPr>
-            <w:tcW w:type="dxa" w:w="7056"/>
+            <w:tcW w:type="dxa" w:w="6624"/>
             <w:vAlign w:val="center"/>
             <w:tcBorders>
               <w:top w:val="single" w:sz="5" w:color="777777"/>
@@ -4739,18 +5188,8 @@
             </w:tcBorders>
           </w:tcPr>
           <w:p>
-            <w:pPr>
-              <w:spacing w:after="0" w:line="240" w:lineRule="auto"/>
-              <w:ind w:firstLine="0"/>
-              <w:jc w:val="left"/>
-            </w:pPr>
             <w:r>
-              <w:rPr>
-                <w:rFonts w:ascii="Times New Roman" w:hAnsi="Times New Roman"/>
-                <w:color w:val="000000"/>
-                <w:sz w:val="26"/>
-              </w:rPr>
-              <w:t>Các container ở trạng thái phù hợp trong docker compose ps.</w:t>
+              <w:t>Trang chủ HTTPS hiển thị các sản phẩm cà phê; xem Hình 2.2.</w:t>
             </w:r>
           </w:p>
         </w:tc>
@@ -4761,7 +5200,7 @@
         </w:trPr>
         <w:tc>
           <w:tcPr>
-            <w:tcW w:type="dxa" w:w="2232"/>
+            <w:tcW w:type="dxa" w:w="2376"/>
             <w:vAlign w:val="center"/>
             <w:tcBorders>
               <w:top w:val="single" w:sz="5" w:color="777777"/>
@@ -4773,24 +5212,14 @@
             </w:tcBorders>
           </w:tcPr>
           <w:p>
-            <w:pPr>
-              <w:spacing w:after="0" w:line="240" w:lineRule="auto"/>
-              <w:ind w:firstLine="0"/>
-              <w:jc w:val="left"/>
-            </w:pPr>
             <w:r>
-              <w:rPr>
-                <w:rFonts w:ascii="Times New Roman" w:hAnsi="Times New Roman"/>
-                <w:color w:val="000000"/>
-                <w:sz w:val="26"/>
-              </w:rPr>
-              <w:t>Prometheus</w:t>
+              <w:t>Docker Compose</w:t>
             </w:r>
           </w:p>
         </w:tc>
         <w:tc>
           <w:tcPr>
-            <w:tcW w:type="dxa" w:w="7056"/>
+            <w:tcW w:type="dxa" w:w="6624"/>
             <w:vAlign w:val="center"/>
             <w:tcBorders>
               <w:top w:val="single" w:sz="5" w:color="777777"/>
@@ -4802,18 +5231,8 @@
             </w:tcBorders>
           </w:tcPr>
           <w:p>
-            <w:pPr>
-              <w:spacing w:after="0" w:line="240" w:lineRule="auto"/>
-              <w:ind w:firstLine="0"/>
-              <w:jc w:val="left"/>
-            </w:pPr>
             <w:r>
-              <w:rPr>
-                <w:rFonts w:ascii="Times New Roman" w:hAnsi="Times New Roman"/>
-                <w:color w:val="000000"/>
-                <w:sz w:val="26"/>
-              </w:rPr>
-              <w:t>Status → Targets với các job UP.</w:t>
+              <w:t>Đã kiểm tra trạng thái dịch vụ bằng docker compose ps; MySQL và cAdvisor healthy.</w:t>
             </w:r>
           </w:p>
         </w:tc>
@@ -4824,7 +5243,7 @@
         </w:trPr>
         <w:tc>
           <w:tcPr>
-            <w:tcW w:type="dxa" w:w="2232"/>
+            <w:tcW w:type="dxa" w:w="2376"/>
             <w:vAlign w:val="center"/>
             <w:tcBorders>
               <w:top w:val="single" w:sz="5" w:color="777777"/>
@@ -4836,24 +5255,14 @@
             </w:tcBorders>
           </w:tcPr>
           <w:p>
-            <w:pPr>
-              <w:spacing w:after="0" w:line="240" w:lineRule="auto"/>
-              <w:ind w:firstLine="0"/>
-              <w:jc w:val="left"/>
-            </w:pPr>
             <w:r>
-              <w:rPr>
-                <w:rFonts w:ascii="Times New Roman" w:hAnsi="Times New Roman"/>
-                <w:color w:val="000000"/>
-                <w:sz w:val="26"/>
-              </w:rPr>
-              <w:t>Grafana</w:t>
+              <w:t>Nginx HTTPS</w:t>
             </w:r>
           </w:p>
         </w:tc>
         <w:tc>
           <w:tcPr>
-            <w:tcW w:type="dxa" w:w="7056"/>
+            <w:tcW w:type="dxa" w:w="6624"/>
             <w:vAlign w:val="center"/>
             <w:tcBorders>
               <w:top w:val="single" w:sz="5" w:color="777777"/>
@@ -4865,18 +5274,8 @@
             </w:tcBorders>
           </w:tcPr>
           <w:p>
-            <w:pPr>
-              <w:spacing w:after="0" w:line="240" w:lineRule="auto"/>
-              <w:ind w:firstLine="0"/>
-              <w:jc w:val="left"/>
-            </w:pPr>
             <w:r>
-              <w:rPr>
-                <w:rFonts w:ascii="Times New Roman" w:hAnsi="Times New Roman"/>
-                <w:color w:val="000000"/>
-                <w:sz w:val="26"/>
-              </w:rPr>
-              <w:t>Dashboard có dữ liệu CPU/RAM, Nginx và MySQL.</w:t>
+              <w:t>Reverse proxy HTTPS và security headers được cấu hình; xem Hình 3.1.</w:t>
             </w:r>
           </w:p>
         </w:tc>
@@ -4887,7 +5286,7 @@
         </w:trPr>
         <w:tc>
           <w:tcPr>
-            <w:tcW w:type="dxa" w:w="2232"/>
+            <w:tcW w:type="dxa" w:w="2376"/>
             <w:vAlign w:val="center"/>
             <w:tcBorders>
               <w:top w:val="single" w:sz="5" w:color="777777"/>
@@ -4899,24 +5298,14 @@
             </w:tcBorders>
           </w:tcPr>
           <w:p>
-            <w:pPr>
-              <w:spacing w:after="0" w:line="240" w:lineRule="auto"/>
-              <w:ind w:firstLine="0"/>
-              <w:jc w:val="left"/>
-            </w:pPr>
             <w:r>
-              <w:rPr>
-                <w:rFonts w:ascii="Times New Roman" w:hAnsi="Times New Roman"/>
-                <w:color w:val="000000"/>
-                <w:sz w:val="26"/>
-              </w:rPr>
-              <w:t>Loki</w:t>
+              <w:t>Prometheus</w:t>
             </w:r>
           </w:p>
         </w:tc>
         <w:tc>
           <w:tcPr>
-            <w:tcW w:type="dxa" w:w="7056"/>
+            <w:tcW w:type="dxa" w:w="6624"/>
             <w:vAlign w:val="center"/>
             <w:tcBorders>
               <w:top w:val="single" w:sz="5" w:color="777777"/>
@@ -4928,18 +5317,8 @@
             </w:tcBorders>
           </w:tcPr>
           <w:p>
-            <w:pPr>
-              <w:spacing w:after="0" w:line="240" w:lineRule="auto"/>
-              <w:ind w:firstLine="0"/>
-              <w:jc w:val="left"/>
-            </w:pPr>
             <w:r>
-              <w:rPr>
-                <w:rFonts w:ascii="Times New Roman" w:hAnsi="Times New Roman"/>
-                <w:color w:val="000000"/>
-                <w:sz w:val="26"/>
-              </w:rPr>
-              <w:t>Grafana Explore trả về log với truy vấn {job="docker"}.</w:t>
+              <w:t>Năm job scrape ở trạng thái UP, gồm 4 exporter và Prometheus self-monitoring; xem Hình 4.1.</w:t>
             </w:r>
           </w:p>
         </w:tc>
@@ -4950,7 +5329,7 @@
         </w:trPr>
         <w:tc>
           <w:tcPr>
-            <w:tcW w:type="dxa" w:w="2232"/>
+            <w:tcW w:type="dxa" w:w="2376"/>
             <w:vAlign w:val="center"/>
             <w:tcBorders>
               <w:top w:val="single" w:sz="5" w:color="777777"/>
@@ -4962,24 +5341,14 @@
             </w:tcBorders>
           </w:tcPr>
           <w:p>
-            <w:pPr>
-              <w:spacing w:after="0" w:line="240" w:lineRule="auto"/>
-              <w:ind w:firstLine="0"/>
-              <w:jc w:val="left"/>
-            </w:pPr>
             <w:r>
-              <w:rPr>
-                <w:rFonts w:ascii="Times New Roman" w:hAnsi="Times New Roman"/>
-                <w:color w:val="000000"/>
-                <w:sz w:val="26"/>
-              </w:rPr>
-              <w:t>phpMyAdmin</w:t>
+              <w:t>Grafana</w:t>
             </w:r>
           </w:p>
         </w:tc>
         <w:tc>
           <w:tcPr>
-            <w:tcW w:type="dxa" w:w="7056"/>
+            <w:tcW w:type="dxa" w:w="6624"/>
             <w:vAlign w:val="center"/>
             <w:tcBorders>
               <w:top w:val="single" w:sz="5" w:color="777777"/>
@@ -4991,18 +5360,92 @@
             </w:tcBorders>
           </w:tcPr>
           <w:p>
-            <w:pPr>
-              <w:spacing w:after="0" w:line="240" w:lineRule="auto"/>
-              <w:ind w:firstLine="0"/>
-              <w:jc w:val="left"/>
-            </w:pPr>
             <w:r>
-              <w:rPr>
-                <w:rFonts w:ascii="Times New Roman" w:hAnsi="Times New Roman"/>
-                <w:color w:val="000000"/>
-                <w:sz w:val="26"/>
-              </w:rPr>
-              <w:t>Database wordpress_db và các bảng WordPress.</w:t>
+              <w:t>Dashboard có metrics CPU/RAM, Nginx và MySQL; xem Hình 4.2.</w:t>
+            </w:r>
+          </w:p>
+        </w:tc>
+      </w:tr>
+      <w:tr>
+        <w:tc>
+          <w:tcPr>
+            <w:tcW w:type="dxa" w:w="2376"/>
+            <w:vAlign w:val="center"/>
+            <w:tcBorders>
+              <w:top w:val="single" w:sz="5" w:color="777777"/>
+              <w:left w:val="single" w:sz="5" w:color="777777"/>
+              <w:bottom w:val="single" w:sz="5" w:color="777777"/>
+              <w:right w:val="single" w:sz="5" w:color="777777"/>
+              <w:insideH w:val="single" w:sz="5" w:color="777777"/>
+              <w:insideV w:val="single" w:sz="5" w:color="777777"/>
+            </w:tcBorders>
+          </w:tcPr>
+          <w:p>
+            <w:pPr/>
+            <w:r>
+              <w:t>Loki / Promtail</w:t>
+            </w:r>
+          </w:p>
+        </w:tc>
+        <w:tc>
+          <w:tcPr>
+            <w:tcW w:type="dxa" w:w="6624"/>
+            <w:vAlign w:val="center"/>
+            <w:tcBorders>
+              <w:top w:val="single" w:sz="5" w:color="777777"/>
+              <w:left w:val="single" w:sz="5" w:color="777777"/>
+              <w:bottom w:val="single" w:sz="5" w:color="777777"/>
+              <w:right w:val="single" w:sz="5" w:color="777777"/>
+              <w:insideH w:val="single" w:sz="5" w:color="777777"/>
+              <w:insideV w:val="single" w:sz="5" w:color="777777"/>
+            </w:tcBorders>
+          </w:tcPr>
+          <w:p>
+            <w:pPr/>
+            <w:r>
+              <w:t>Grafana Explore truy vấn {job="docker"} trả về log; xem Hình 4.3.</w:t>
+            </w:r>
+          </w:p>
+        </w:tc>
+      </w:tr>
+      <w:tr>
+        <w:tc>
+          <w:tcPr>
+            <w:tcW w:type="dxa" w:w="2376"/>
+            <w:vAlign w:val="center"/>
+            <w:tcBorders>
+              <w:top w:val="single" w:sz="5" w:color="777777"/>
+              <w:left w:val="single" w:sz="5" w:color="777777"/>
+              <w:bottom w:val="single" w:sz="5" w:color="777777"/>
+              <w:right w:val="single" w:sz="5" w:color="777777"/>
+              <w:insideH w:val="single" w:sz="5" w:color="777777"/>
+              <w:insideV w:val="single" w:sz="5" w:color="777777"/>
+            </w:tcBorders>
+          </w:tcPr>
+          <w:p>
+            <w:pPr/>
+            <w:r>
+              <w:t>phpMyAdmin</w:t>
+            </w:r>
+          </w:p>
+        </w:tc>
+        <w:tc>
+          <w:tcPr>
+            <w:tcW w:type="dxa" w:w="6624"/>
+            <w:vAlign w:val="center"/>
+            <w:tcBorders>
+              <w:top w:val="single" w:sz="5" w:color="777777"/>
+              <w:left w:val="single" w:sz="5" w:color="777777"/>
+              <w:bottom w:val="single" w:sz="5" w:color="777777"/>
+              <w:right w:val="single" w:sz="5" w:color="777777"/>
+              <w:insideH w:val="single" w:sz="5" w:color="777777"/>
+              <w:insideV w:val="single" w:sz="5" w:color="777777"/>
+            </w:tcBorders>
+          </w:tcPr>
+          <w:p>
+            <w:pPr/>
+            <w:r>
+              <w:t>Database wordpress_db có 12 bảng WordPress; xem Hình 2.3.</w:t>
             </w:r>
           </w:p>
         </w:tc>
@@ -5062,12 +5505,7 @@
           <w:color w:val="000000"/>
           <w:sz w:val="26"/>
         </w:rPr>
-        <w:t>Trước khi nộp, cần bổ sung ảnh minh chứng chụp từ hệ thống và ghi URL repository https://github.com/Study332/DTC245010044_De3_WordPress. Hướng phát triển tiếp theo là thay chứng chỉ demo bằng TLS hợp lệ, bổ sung cảnh báo vận hành và chuyển Promtail sang Alloy.</w:t>
-      </w:r>
-    </w:p>
-    <w:p>
-      <w:r>
-        <w:br w:type="page"/>
+        <w:t>Báo cáo đã tích hợp ảnh minh chứng chụp trực tiếp từ GitHub, website WordPress, phpMyAdmin, cấu hình Nginx, Prometheus, Grafana và Loki. Hướng phát triển tiếp theo là thay chứng chỉ demo bằng TLS hợp lệ, bổ sung cảnh báo vận hành và chuyển Promtail sang Alloy.</w:t>
       </w:r>
     </w:p>
     <w:p>

</xml_diff>

<commit_message>
Chuyển website sang quảng bá chè Thái Nguyên
</commit_message>
<xml_diff>
--- a/Bai_lam_De3_WordPress/Bao_cao_De_3_WordPress.docx
+++ b/Bai_lam_De3_WordPress/Bao_cao_De_3_WordPress.docx
@@ -481,7 +481,7 @@
           <w:color w:val="000000"/>
           <w:sz w:val="26"/>
         </w:rPr>
-        <w:t>2.2. Website WordPress Nương</w:t>
+        <w:t>2.2. Website quảng bá chè Thái Nguyên</w:t>
         <w:tab/>
         <w:t>4</w:t>
       </w:r>
@@ -868,7 +868,7 @@
         <w:ind w:firstLine="0"/>
       </w:pPr>
       <w:r>
-        <w:t>Hình 2.2: Trang chủ WordPress với các sản phẩm cà phê</w:t>
+        <w:t>Hình 2.2: Giao diện website trước khi chuyển sang chè Thái Nguyên</w:t>
         <w:tab/>
         <w:t>5</w:t>
       </w:r>
@@ -1003,7 +1003,7 @@
           <w:color w:val="000000"/>
           <w:sz w:val="26"/>
         </w:rPr>
-        <w:t>Báo cáo với đề tài “Website quảng bá sản phẩm bằng WordPress” (Đề 3) trình bày quá trình thiết kế website giới thiệu thương hiệu cà phê đặc sản Nương, tổ chức mã nguồn và cấu hình triển khai bằng Docker Compose. Hệ thống sử dụng WordPress và MySQL làm tầng ứng dụng, Nginx làm reverse proxy, Prometheus và Grafana cho giám sát metrics, Loki và Promtail cho quản lý log tập trung.</w:t>
+        <w:t>Báo cáo với đề tài “Website quảng bá sản phẩm bằng WordPress” (Đề 3) trình bày quá trình thiết kế website giới thiệu chè Thái Nguyên, tổ chức mã nguồn và cấu hình triển khai bằng Docker Compose. Hệ thống sử dụng WordPress và MySQL làm tầng ứng dụng, Nginx làm reverse proxy, Prometheus và Grafana cho giám sát metrics, Loki và Promtail cho quản lý log tập trung.</w:t>
       </w:r>
     </w:p>
     <w:p>
@@ -1112,7 +1112,7 @@
           <w:color w:val="000000"/>
           <w:sz w:val="26"/>
         </w:rPr>
-        <w:t>Mục tiêu là xây dựng website WordPress giới thiệu sản phẩm có thể quản trị nội dung, đồng thời triển khai kèm CSDL, proxy, giám sát và log tập trung. Website chọn thương hiệu cà phê Việt Nam Nương để trình bày vùng trồng, hương vị và thông tin sản phẩm.</w:t>
+        <w:t>Mục tiêu là xây dựng website WordPress giới thiệu sản phẩm có thể quản trị nội dung, đồng thời triển khai kèm CSDL, proxy, giám sát và log tập trung. Website quảng bá các dòng chè Móc Câu, Nõn Tôm ở Tân Cương và chè xanh La Bằng, Thái Nguyên.</w:t>
       </w:r>
     </w:p>
     <w:p>
@@ -1582,18 +1582,8 @@
             </w:tcBorders>
           </w:tcPr>
           <w:p>
-            <w:pPr>
-              <w:spacing w:after="0" w:line="240" w:lineRule="auto"/>
-              <w:ind w:firstLine="0"/>
-              <w:jc w:val="left"/>
-            </w:pPr>
             <w:r>
-              <w:rPr>
-                <w:rFonts w:ascii="Times New Roman" w:hAnsi="Times New Roman"/>
-                <w:color w:val="000000"/>
-                <w:sz w:val="26"/>
-              </w:rPr>
-              <w:t>Website Nương và WordPress Admin.</w:t>
+              <w:t>Website chè Thái Nguyên và WordPress Admin.</w:t>
             </w:r>
           </w:p>
         </w:tc>
@@ -2568,7 +2558,7 @@
           <w:color w:val="000000"/>
           <w:sz w:val="28"/>
         </w:rPr>
-        <w:t>2.2. Website WordPress Nương</w:t>
+        <w:t>2.2. Website quảng bá chè Thái Nguyên</w:t>
       </w:r>
     </w:p>
     <w:p>
@@ -2585,7 +2575,7 @@
           <w:color w:val="000000"/>
           <w:sz w:val="26"/>
         </w:rPr>
-        <w:t>Theme moc-may tạo trang chủ giới thiệu cà phê đặc sản Việt Nam với khu vực câu chuyện thương hiệu, sản phẩm, gợi ý pha và liên hệ. WordPress có post type ca_phe để quản trị danh mục mà không phải sửa mã giao diện.</w:t>
+        <w:t>Theme moc-may tạo trang chủ giới thiệu chè Thái Nguyên với khu vực vùng chè, danh mục sản phẩm, câu chuyện, gợi ý pha và liên hệ. WordPress quản lý sản phẩm bằng một loại nội dung riêng; mã định danh nội bộ được giữ để tương thích dữ liệu đã có.</w:t>
       </w:r>
     </w:p>
     <w:p>
@@ -2600,7 +2590,7 @@
           <w:color w:val="000000"/>
           <w:sz w:val="26"/>
         </w:rPr>
-        <w:t>+ Trường sản phẩm: tên, mô tả, giá, vùng trồng, ghi chú hương vị và nhãn nổi bật.</w:t>
+        <w:t>+ Trường sản phẩm: tên, mô tả, giá tham khảo, vùng chè, ghi chú hương vị và nhãn nổi bật.</w:t>
       </w:r>
     </w:p>
     <w:p>
@@ -2615,7 +2605,7 @@
           <w:color w:val="000000"/>
           <w:sz w:val="26"/>
         </w:rPr>
-        <w:t>+ Tác vụ wordpress-init kích hoạt theme, đặt múi giờ Asia/Ho_Chi_Minh, permalink và tạo ba sản phẩm mẫu khi cài đặt mới.</w:t>
+        <w:t>+ Tác vụ wordpress-init kích hoạt theme, đặt múi giờ Asia/Ho_Chi_Minh, permalink, tạo ba sản phẩm chè mẫu khi cài mới và chuyển dữ liệu demo cũ sang danh mục chè khi chạy trên site đã cài đặt.</w:t>
       </w:r>
     </w:p>
     <w:p>
@@ -2687,7 +2677,7 @@
           <w:i/>
           <w:sz w:val="18"/>
         </w:rPr>
-        <w:t>Hình 2.2: Trang chủ WordPress Nương hiển thị các sản phẩm cà phê.</w:t>
+        <w:t>Hình 2.2: Giao diện website trước khi chuyển sang chè Thái Nguyên.</w:t>
       </w:r>
     </w:p>
     <w:p>
@@ -5189,7 +5179,7 @@
           </w:tcPr>
           <w:p>
             <w:r>
-              <w:t>Trang chủ HTTPS hiển thị các sản phẩm cà phê; xem Hình 2.2.</w:t>
+              <w:t>Trang chủ HTTPS hiện hiển thị 3 sản phẩm chè; Hình 2.2 là ảnh giao diện trước khi chuyển đổi.</w:t>
             </w:r>
           </w:p>
         </w:tc>
@@ -5488,7 +5478,7 @@
           <w:color w:val="000000"/>
           <w:sz w:val="26"/>
         </w:rPr>
-        <w:t>Đề tài đã tổ chức một website quảng bá cà phê trên WordPress, CSDL MySQL và công cụ quản trị phpMyAdmin trong kiến trúc Docker Compose. Nginx làm reverse proxy HTTPS; Prometheus/Grafana cung cấp giám sát; Loki/Promtail tập trung log. Cấu hình cũng tách mạng, giới hạn tài nguyên, dùng secret qua .env và hạn chế cổng quản trị ở loopback.</w:t>
+        <w:t>Đề tài đã tổ chức một website quảng bá chè Thái Nguyên trên WordPress, CSDL MySQL và công cụ quản trị phpMyAdmin trong kiến trúc Docker Compose. Nginx làm reverse proxy HTTPS; Prometheus/Grafana cung cấp giám sát; Loki/Promtail tập trung log. Cấu hình cũng tách mạng, giới hạn tài nguyên, dùng secret qua .env và hạn chế cổng quản trị ở loopback.</w:t>
       </w:r>
     </w:p>
     <w:p>

</xml_diff>

<commit_message>
Cập nhật báo cáo và ảnh website chè
</commit_message>
<xml_diff>
--- a/Bai_lam_De3_WordPress/Bao_cao_De_3_WordPress.docx
+++ b/Bai_lam_De3_WordPress/Bao_cao_De_3_WordPress.docx
@@ -868,7 +868,7 @@
         <w:ind w:firstLine="0"/>
       </w:pPr>
       <w:r>
-        <w:t>Hình 2.2: Giao diện website trước khi chuyển sang chè Thái Nguyên</w:t>
+        <w:t>Hình 2.2: Giao diện trang chủ quảng bá chè Thái Nguyên</w:t>
         <w:tab/>
         <w:t>5</w:t>
       </w:r>
@@ -2575,7 +2575,7 @@
           <w:color w:val="000000"/>
           <w:sz w:val="26"/>
         </w:rPr>
-        <w:t>Theme moc-may tạo trang chủ giới thiệu chè Thái Nguyên với khu vực vùng chè, danh mục sản phẩm, câu chuyện, gợi ý pha và liên hệ. WordPress quản lý sản phẩm bằng một loại nội dung riêng; mã định danh nội bộ được giữ để tương thích dữ liệu đã có.</w:t>
+        <w:t>Theme moc-may tạo trang chủ chè Thái Nguyên với danh mục sản phẩm, câu chuyện vùng chè, gợi ý pha và liên hệ. WordPress quản lý sản phẩm bằng loại nội dung riêng. Giao diện có gói chè nổi nhẹ, hơi trà chuyển động, các mục lần lượt xuất hiện khi cuộn và thẻ phản hồi khi rê chuột; hiệu ứng được làm bằng CSS và IntersectionObserver, đồng thời tôn trọng cài đặt giảm chuyển động của trình duyệt.</w:t>
       </w:r>
     </w:p>
     <w:p>
@@ -2677,7 +2677,7 @@
           <w:i/>
           <w:sz w:val="18"/>
         </w:rPr>
-        <w:t>Hình 2.2: Giao diện website trước khi chuyển sang chè Thái Nguyên.</w:t>
+        <w:t>Hình 2.2: Giao diện trang chủ quảng bá chè Thái Nguyên.</w:t>
       </w:r>
     </w:p>
     <w:p>
@@ -5179,7 +5179,7 @@
           </w:tcPr>
           <w:p>
             <w:r>
-              <w:t>Trang chủ HTTPS hiện hiển thị 3 sản phẩm chè; Hình 2.2 là ảnh giao diện trước khi chuyển đổi.</w:t>
+              <w:t>Trang chủ giới thiệu chè Thái Nguyên với ba sản phẩm; xem Hình 2.2. Hiệu ứng được mô tả tại mục 2.2.</w:t>
             </w:r>
           </w:p>
         </w:tc>
@@ -5478,7 +5478,7 @@
           <w:color w:val="000000"/>
           <w:sz w:val="26"/>
         </w:rPr>
-        <w:t>Đề tài đã tổ chức một website quảng bá chè Thái Nguyên trên WordPress, CSDL MySQL và công cụ quản trị phpMyAdmin trong kiến trúc Docker Compose. Nginx làm reverse proxy HTTPS; Prometheus/Grafana cung cấp giám sát; Loki/Promtail tập trung log. Cấu hình cũng tách mạng, giới hạn tài nguyên, dùng secret qua .env và hạn chế cổng quản trị ở loopback.</w:t>
+        <w:t>Đề tài đã tổ chức một website quảng bá chè Thái Nguyên trên WordPress, CSDL MySQL và công cụ quản trị phpMyAdmin trong kiến trúc Docker Compose. Giao diện có các chuyển động nhẹ khi mở trang, cuộn và tương tác với thẻ sản phẩm; người dùng có thể tắt chúng qua cài đặt giảm chuyển động của trình duyệt. Nginx làm reverse proxy HTTPS; Prometheus/Grafana cung cấp giám sát; Loki/Promtail tập trung log. Cấu hình cũng tách mạng, giới hạn tài nguyên, dùng secret qua .env và hạn chế cổng quản trị ở loopback.</w:t>
       </w:r>
     </w:p>
     <w:p>

</xml_diff>